<commit_message>
docs: revise client presentation for shop owner with simple step-by-step feature handbook and credentials
</commit_message>
<xml_diff>
--- a/Kirana_Point_Client_Feature_Presentation.docx
+++ b/Kirana_Point_Client_Feature_Presentation.docx
@@ -26,9 +26,9 @@
           <w:color w:val="1E293B"/>
           <w:sz w:val="26"/>
         </w:rPr>
-        <w:t>Next-Generation Local Grocery E-Commerce &amp; PWA Platform</w:t>
+        <w:t>Your Store Is Now Online!</w:t>
         <w:br/>
-        <w:t>Comprehensive Client Feature Proposal &amp; Technical Capability Document</w:t>
+        <w:t>Owner Guide &amp; Feature Handbook for Mr. Pratham Tarde</w:t>
       </w:r>
     </w:p>
     <w:tbl>
@@ -60,7 +60,7 @@
                 <w:color w:val="2D7A3A"/>
                 <w:sz w:val="20"/>
               </w:rPr>
-              <w:t>Store Owner / Client:</w:t>
+              <w:t>Store Name &amp; Owner:</w:t>
             </w:r>
           </w:p>
         </w:tc>
@@ -81,7 +81,7 @@
                 <w:color w:val="1E293B"/>
                 <w:sz w:val="20"/>
               </w:rPr>
-              <w:t>Mr. Pratham Tarde</w:t>
+              <w:t>Kirana Point — Mr. Pratham Tarde</w:t>
             </w:r>
           </w:p>
         </w:tc>
@@ -105,7 +105,7 @@
                 <w:color w:val="2D7A3A"/>
                 <w:sz w:val="20"/>
               </w:rPr>
-              <w:t>Store Name &amp; Location:</w:t>
+              <w:t>Store Address:</w:t>
             </w:r>
           </w:p>
         </w:tc>
@@ -126,7 +126,7 @@
                 <w:color w:val="1E293B"/>
                 <w:sz w:val="20"/>
               </w:rPr>
-              <w:t>Kirana Point — Main Road, Khamgaon, Dist. Buldhana, Maharashtra 444303</w:t>
+              <w:t>Main Road, Khamgaon, Dist. Buldhana, Maharashtra 444303</w:t>
             </w:r>
           </w:p>
         </w:tc>
@@ -150,7 +150,53 @@
                 <w:color w:val="2D7A3A"/>
                 <w:sz w:val="20"/>
               </w:rPr>
-              <w:t>Direct UPI &amp; Phone:</w:t>
+              <w:t>Live Website Link:</w:t>
+            </w:r>
+          </w:p>
+        </w:tc>
+        <w:tc>
+          <w:tcPr>
+            <w:tcW w:type="dxa" w:w="6480"/>
+            <w:shd w:fill="F8FAFC"/>
+            <w:tcMar>
+              <w:top w:w="100" w:type="dxa"/>
+              <w:bottom w:w="100" w:type="dxa"/>
+              <w:left w:w="150" w:type="dxa"/>
+              <w:right w:w="150" w:type="dxa"/>
+            </w:tcMar>
+          </w:tcPr>
+          <w:p>
+            <w:r>
+              <w:rPr>
+                <w:b/>
+                <w:color w:val="1E293B"/>
+                <w:sz w:val="20"/>
+              </w:rPr>
+              <w:t>https://kirana-point.vercel.app</w:t>
+            </w:r>
+          </w:p>
+        </w:tc>
+      </w:tr>
+      <w:tr>
+        <w:tc>
+          <w:tcPr>
+            <w:tcW w:type="dxa" w:w="3168"/>
+            <w:shd w:fill="F0FDF4"/>
+            <w:tcMar>
+              <w:top w:w="100" w:type="dxa"/>
+              <w:bottom w:w="100" w:type="dxa"/>
+              <w:left w:w="150" w:type="dxa"/>
+              <w:right w:w="150" w:type="dxa"/>
+            </w:tcMar>
+          </w:tcPr>
+          <w:p>
+            <w:r>
+              <w:rPr>
+                <w:b/>
+                <w:color w:val="2D7A3A"/>
+                <w:sz w:val="20"/>
+              </w:rPr>
+              <w:t>Store UPI &amp; WhatsApp:</w:t>
             </w:r>
           </w:p>
         </w:tc>
@@ -176,16 +222,46 @@
           </w:p>
         </w:tc>
       </w:tr>
+    </w:tbl>
+    <w:p>
+      <w:pPr>
+        <w:spacing w:after="200"/>
+      </w:pPr>
+    </w:p>
+    <w:p>
+      <w:pPr>
+        <w:pStyle w:val="Heading1"/>
+        <w:spacing w:before="240" w:after="80"/>
+      </w:pPr>
+      <w:r>
+        <w:t>1. Your Store Owner Login Credentials</w:t>
+      </w:r>
+    </w:p>
+    <w:p>
+      <w:r>
+        <w:t>Keep these login details safe. You will use them to open your store admin panel, manage products, check incoming customer orders, and verify UPI payments.</w:t>
+      </w:r>
+    </w:p>
+    <w:tbl>
+      <w:tblPr>
+        <w:tblW w:type="auto" w:w="0"/>
+        <w:jc w:val="center"/>
+        <w:tblLook w:firstColumn="1" w:firstRow="1" w:lastColumn="0" w:lastRow="0" w:noHBand="0" w:noVBand="1" w:val="04A0"/>
+      </w:tblPr>
+      <w:tblGrid>
+        <w:gridCol w:w="4968"/>
+        <w:gridCol w:w="4968"/>
+      </w:tblGrid>
       <w:tr>
         <w:tc>
           <w:tcPr>
-            <w:tcW w:type="dxa" w:w="3168"/>
+            <w:tcW w:type="dxa" w:w="3600"/>
             <w:shd w:fill="F0FDF4"/>
             <w:tcMar>
               <w:top w:w="100" w:type="dxa"/>
               <w:bottom w:w="100" w:type="dxa"/>
-              <w:left w:w="150" w:type="dxa"/>
-              <w:right w:w="150" w:type="dxa"/>
+              <w:left w:w="140" w:type="dxa"/>
+              <w:right w:w="140" w:type="dxa"/>
             </w:tcMar>
           </w:tcPr>
           <w:p>
@@ -195,28 +271,213 @@
                 <w:color w:val="2D7A3A"/>
                 <w:sz w:val="20"/>
               </w:rPr>
-              <w:t>Platform Architecture:</w:t>
+              <w:t>Store Website Link</w:t>
             </w:r>
           </w:p>
         </w:tc>
         <w:tc>
           <w:tcPr>
-            <w:tcW w:type="dxa" w:w="6480"/>
-            <w:shd w:fill="F8FAFC"/>
+            <w:tcW w:type="dxa" w:w="6048"/>
+            <w:shd w:fill="FFFFFF"/>
             <w:tcMar>
               <w:top w:w="100" w:type="dxa"/>
               <w:bottom w:w="100" w:type="dxa"/>
-              <w:left w:w="150" w:type="dxa"/>
-              <w:right w:w="150" w:type="dxa"/>
+              <w:left w:w="140" w:type="dxa"/>
+              <w:right w:w="140" w:type="dxa"/>
             </w:tcMar>
           </w:tcPr>
           <w:p>
             <w:r>
               <w:rPr>
+                <w:b/>
                 <w:color w:val="1E293B"/>
                 <w:sz w:val="20"/>
               </w:rPr>
-              <w:t>Next.js 14 (App Router), TypeScript, TailwindCSS, Firebase Firestore, PWA, Leaflet GPS</w:t>
+              <w:t>https://kirana-point.vercel.app</w:t>
+            </w:r>
+          </w:p>
+        </w:tc>
+      </w:tr>
+      <w:tr>
+        <w:tc>
+          <w:tcPr>
+            <w:tcW w:type="dxa" w:w="3600"/>
+            <w:shd w:fill="F0FDF4"/>
+            <w:tcMar>
+              <w:top w:w="100" w:type="dxa"/>
+              <w:bottom w:w="100" w:type="dxa"/>
+              <w:left w:w="140" w:type="dxa"/>
+              <w:right w:w="140" w:type="dxa"/>
+            </w:tcMar>
+          </w:tcPr>
+          <w:p>
+            <w:r>
+              <w:rPr>
+                <w:b/>
+                <w:color w:val="2D7A3A"/>
+                <w:sz w:val="20"/>
+              </w:rPr>
+              <w:t>Admin Portal Direct Link</w:t>
+            </w:r>
+          </w:p>
+        </w:tc>
+        <w:tc>
+          <w:tcPr>
+            <w:tcW w:type="dxa" w:w="6048"/>
+            <w:shd w:fill="FFFFFF"/>
+            <w:tcMar>
+              <w:top w:w="100" w:type="dxa"/>
+              <w:bottom w:w="100" w:type="dxa"/>
+              <w:left w:w="140" w:type="dxa"/>
+              <w:right w:w="140" w:type="dxa"/>
+            </w:tcMar>
+          </w:tcPr>
+          <w:p>
+            <w:r>
+              <w:rPr>
+                <w:b/>
+                <w:color w:val="1E293B"/>
+                <w:sz w:val="20"/>
+              </w:rPr>
+              <w:t>https://kirana-point.vercel.app/admin</w:t>
+            </w:r>
+          </w:p>
+        </w:tc>
+      </w:tr>
+      <w:tr>
+        <w:tc>
+          <w:tcPr>
+            <w:tcW w:type="dxa" w:w="3600"/>
+            <w:shd w:fill="F0FDF4"/>
+            <w:tcMar>
+              <w:top w:w="100" w:type="dxa"/>
+              <w:bottom w:w="100" w:type="dxa"/>
+              <w:left w:w="140" w:type="dxa"/>
+              <w:right w:w="140" w:type="dxa"/>
+            </w:tcMar>
+          </w:tcPr>
+          <w:p>
+            <w:r>
+              <w:rPr>
+                <w:b/>
+                <w:color w:val="2D7A3A"/>
+                <w:sz w:val="20"/>
+              </w:rPr>
+              <w:t>Login Email / Phone</w:t>
+            </w:r>
+          </w:p>
+        </w:tc>
+        <w:tc>
+          <w:tcPr>
+            <w:tcW w:type="dxa" w:w="6048"/>
+            <w:shd w:fill="FFFFFF"/>
+            <w:tcMar>
+              <w:top w:w="100" w:type="dxa"/>
+              <w:bottom w:w="100" w:type="dxa"/>
+              <w:left w:w="140" w:type="dxa"/>
+              <w:right w:w="140" w:type="dxa"/>
+            </w:tcMar>
+          </w:tcPr>
+          <w:p>
+            <w:r>
+              <w:rPr>
+                <w:b/>
+                <w:color w:val="1E293B"/>
+                <w:sz w:val="20"/>
+              </w:rPr>
+              <w:t>pratham@kiranapoint.com  (or your phone: 8208232735)</w:t>
+            </w:r>
+          </w:p>
+        </w:tc>
+      </w:tr>
+      <w:tr>
+        <w:tc>
+          <w:tcPr>
+            <w:tcW w:type="dxa" w:w="3600"/>
+            <w:shd w:fill="F0FDF4"/>
+            <w:tcMar>
+              <w:top w:w="100" w:type="dxa"/>
+              <w:bottom w:w="100" w:type="dxa"/>
+              <w:left w:w="140" w:type="dxa"/>
+              <w:right w:w="140" w:type="dxa"/>
+            </w:tcMar>
+          </w:tcPr>
+          <w:p>
+            <w:r>
+              <w:rPr>
+                <w:b/>
+                <w:color w:val="2D7A3A"/>
+                <w:sz w:val="20"/>
+              </w:rPr>
+              <w:t>Admin Password</w:t>
+            </w:r>
+          </w:p>
+        </w:tc>
+        <w:tc>
+          <w:tcPr>
+            <w:tcW w:type="dxa" w:w="6048"/>
+            <w:shd w:fill="FFFFFF"/>
+            <w:tcMar>
+              <w:top w:w="100" w:type="dxa"/>
+              <w:bottom w:w="100" w:type="dxa"/>
+              <w:left w:w="140" w:type="dxa"/>
+              <w:right w:w="140" w:type="dxa"/>
+            </w:tcMar>
+          </w:tcPr>
+          <w:p>
+            <w:r>
+              <w:rPr>
+                <w:b/>
+                <w:color w:val="1E293B"/>
+                <w:sz w:val="20"/>
+              </w:rPr>
+              <w:t>admin123</w:t>
+            </w:r>
+          </w:p>
+        </w:tc>
+      </w:tr>
+      <w:tr>
+        <w:tc>
+          <w:tcPr>
+            <w:tcW w:type="dxa" w:w="3600"/>
+            <w:shd w:fill="F0FDF4"/>
+            <w:tcMar>
+              <w:top w:w="100" w:type="dxa"/>
+              <w:bottom w:w="100" w:type="dxa"/>
+              <w:left w:w="140" w:type="dxa"/>
+              <w:right w:w="140" w:type="dxa"/>
+            </w:tcMar>
+          </w:tcPr>
+          <w:p>
+            <w:r>
+              <w:rPr>
+                <w:b/>
+                <w:color w:val="2D7A3A"/>
+                <w:sz w:val="20"/>
+              </w:rPr>
+              <w:t>Your Direct UPI ID for Payments</w:t>
+            </w:r>
+          </w:p>
+        </w:tc>
+        <w:tc>
+          <w:tcPr>
+            <w:tcW w:type="dxa" w:w="6048"/>
+            <w:shd w:fill="FFFFFF"/>
+            <w:tcMar>
+              <w:top w:w="100" w:type="dxa"/>
+              <w:bottom w:w="100" w:type="dxa"/>
+              <w:left w:w="140" w:type="dxa"/>
+              <w:right w:w="140" w:type="dxa"/>
+            </w:tcMar>
+          </w:tcPr>
+          <w:p>
+            <w:r>
+              <w:rPr>
+                <w:b/>
+                <w:color w:val="1E293B"/>
+                <w:sz w:val="20"/>
+              </w:rPr>
+              <w:t>8208232735@axl  (Linked to your bank account)</w:t>
             </w:r>
           </w:p>
         </w:tc>
@@ -224,449 +485,16 @@
     </w:tbl>
     <w:p>
       <w:pPr>
-        <w:spacing w:after="240"/>
+        <w:spacing w:after="200"/>
       </w:pPr>
     </w:p>
     <w:p>
       <w:pPr>
         <w:pStyle w:val="Heading1"/>
-        <w:spacing w:before="280" w:after="120"/>
-      </w:pPr>
-      <w:r>
-        <w:t>1. Executive Summary &amp; Business Advantage</w:t>
-      </w:r>
-    </w:p>
-    <w:p>
-      <w:r>
-        <w:t>Kirana Point is an enterprise-grade, lightning-fast digital grocery platform built specifically for neighbourhood grocery retail. It empowers store owners like Mr. Pratham Tarde to compete directly and win against corporate quick-commerce giants (Blinkit, Zepto, Swiggy Instamart) with complete technological independence.</w:t>
-      </w:r>
-    </w:p>
-    <w:tbl>
-      <w:tblPr>
-        <w:tblW w:type="auto" w:w="0"/>
-        <w:jc w:val="center"/>
-        <w:tblLook w:firstColumn="1" w:firstRow="1" w:lastColumn="0" w:lastRow="0" w:noHBand="0" w:noVBand="1" w:val="04A0"/>
-      </w:tblPr>
-      <w:tblGrid>
-        <w:gridCol w:w="3312"/>
-        <w:gridCol w:w="3312"/>
-        <w:gridCol w:w="3312"/>
-      </w:tblGrid>
-      <w:tr>
-        <w:tc>
-          <w:tcPr>
-            <w:tcW w:type="dxa" w:w="3312"/>
-            <w:shd w:fill="2D7A3A"/>
-            <w:tcMar>
-              <w:top w:w="120" w:type="dxa"/>
-              <w:bottom w:w="120" w:type="dxa"/>
-              <w:left w:w="150" w:type="dxa"/>
-              <w:right w:w="150" w:type="dxa"/>
-            </w:tcMar>
-          </w:tcPr>
-          <w:p>
-            <w:r>
-              <w:rPr>
-                <w:b/>
-                <w:color w:val="FFFFFF"/>
-                <w:sz w:val="20"/>
-              </w:rPr>
-              <w:t>Metric / Capability</w:t>
-            </w:r>
-          </w:p>
-        </w:tc>
-        <w:tc>
-          <w:tcPr>
-            <w:tcW w:type="dxa" w:w="3312"/>
-            <w:shd w:fill="2D7A3A"/>
-            <w:tcMar>
-              <w:top w:w="120" w:type="dxa"/>
-              <w:bottom w:w="120" w:type="dxa"/>
-              <w:left w:w="150" w:type="dxa"/>
-              <w:right w:w="150" w:type="dxa"/>
-            </w:tcMar>
-          </w:tcPr>
-          <w:p>
-            <w:r>
-              <w:rPr>
-                <w:b/>
-                <w:color w:val="FFFFFF"/>
-                <w:sz w:val="20"/>
-              </w:rPr>
-              <w:t>Corporate Apps (Blinkit / Zepto)</w:t>
-            </w:r>
-          </w:p>
-        </w:tc>
-        <w:tc>
-          <w:tcPr>
-            <w:tcW w:type="dxa" w:w="3312"/>
-            <w:shd w:fill="2D7A3A"/>
-            <w:tcMar>
-              <w:top w:w="120" w:type="dxa"/>
-              <w:bottom w:w="120" w:type="dxa"/>
-              <w:left w:w="150" w:type="dxa"/>
-              <w:right w:w="150" w:type="dxa"/>
-            </w:tcMar>
-          </w:tcPr>
-          <w:p>
-            <w:r>
-              <w:rPr>
-                <w:b/>
-                <w:color w:val="FFFFFF"/>
-                <w:sz w:val="20"/>
-              </w:rPr>
-              <w:t>Kirana Point (Your Platform)</w:t>
-            </w:r>
-          </w:p>
-        </w:tc>
-      </w:tr>
-      <w:tr>
-        <w:tc>
-          <w:tcPr>
-            <w:tcW w:type="dxa" w:w="3312"/>
-            <w:shd w:fill="FFFFFF"/>
-            <w:tcMar>
-              <w:top w:w="100" w:type="dxa"/>
-              <w:bottom w:w="100" w:type="dxa"/>
-              <w:left w:w="120" w:type="dxa"/>
-              <w:right w:w="120" w:type="dxa"/>
-            </w:tcMar>
-          </w:tcPr>
-          <w:p>
-            <w:r>
-              <w:rPr>
-                <w:b/>
-                <w:sz w:val="19"/>
-              </w:rPr>
-              <w:t>Platform Commission</w:t>
-            </w:r>
-          </w:p>
-        </w:tc>
-        <w:tc>
-          <w:tcPr>
-            <w:tcW w:type="dxa" w:w="3312"/>
-            <w:shd w:fill="FFFFFF"/>
-            <w:tcMar>
-              <w:top w:w="100" w:type="dxa"/>
-              <w:bottom w:w="100" w:type="dxa"/>
-              <w:left w:w="120" w:type="dxa"/>
-              <w:right w:w="120" w:type="dxa"/>
-            </w:tcMar>
-          </w:tcPr>
-          <w:p>
-            <w:r>
-              <w:rPr>
-                <w:sz w:val="19"/>
-              </w:rPr>
-              <w:t>15% - 25% deducted per order</w:t>
-            </w:r>
-          </w:p>
-        </w:tc>
-        <w:tc>
-          <w:tcPr>
-            <w:tcW w:type="dxa" w:w="3312"/>
-            <w:shd w:fill="F0FDF4"/>
-            <w:tcMar>
-              <w:top w:w="100" w:type="dxa"/>
-              <w:bottom w:w="100" w:type="dxa"/>
-              <w:left w:w="120" w:type="dxa"/>
-              <w:right w:w="120" w:type="dxa"/>
-            </w:tcMar>
-          </w:tcPr>
-          <w:p>
-            <w:r>
-              <w:rPr>
-                <w:b/>
-                <w:color w:val="2D7A3A"/>
-                <w:sz w:val="19"/>
-              </w:rPr>
-              <w:t>0% Commission — 100% profit stays with store</w:t>
-            </w:r>
-          </w:p>
-        </w:tc>
-      </w:tr>
-      <w:tr>
-        <w:tc>
-          <w:tcPr>
-            <w:tcW w:type="dxa" w:w="3312"/>
-            <w:shd w:fill="F8FAFC"/>
-            <w:tcMar>
-              <w:top w:w="100" w:type="dxa"/>
-              <w:bottom w:w="100" w:type="dxa"/>
-              <w:left w:w="120" w:type="dxa"/>
-              <w:right w:w="120" w:type="dxa"/>
-            </w:tcMar>
-          </w:tcPr>
-          <w:p>
-            <w:r>
-              <w:rPr>
-                <w:b/>
-                <w:sz w:val="19"/>
-              </w:rPr>
-              <w:t>Payment Gateway Fees</w:t>
-            </w:r>
-          </w:p>
-        </w:tc>
-        <w:tc>
-          <w:tcPr>
-            <w:tcW w:type="dxa" w:w="3312"/>
-            <w:shd w:fill="F8FAFC"/>
-            <w:tcMar>
-              <w:top w:w="100" w:type="dxa"/>
-              <w:bottom w:w="100" w:type="dxa"/>
-              <w:left w:w="120" w:type="dxa"/>
-              <w:right w:w="120" w:type="dxa"/>
-            </w:tcMar>
-          </w:tcPr>
-          <w:p>
-            <w:r>
-              <w:rPr>
-                <w:sz w:val="19"/>
-              </w:rPr>
-              <w:t>2% - 3% gateway deduction</w:t>
-            </w:r>
-          </w:p>
-        </w:tc>
-        <w:tc>
-          <w:tcPr>
-            <w:tcW w:type="dxa" w:w="3312"/>
-            <w:shd w:fill="F0FDF4"/>
-            <w:tcMar>
-              <w:top w:w="100" w:type="dxa"/>
-              <w:bottom w:w="100" w:type="dxa"/>
-              <w:left w:w="120" w:type="dxa"/>
-              <w:right w:w="120" w:type="dxa"/>
-            </w:tcMar>
-          </w:tcPr>
-          <w:p>
-            <w:r>
-              <w:rPr>
-                <w:b/>
-                <w:color w:val="2D7A3A"/>
-                <w:sz w:val="19"/>
-              </w:rPr>
-              <w:t>₹0 Gateway Fees — Direct UPI to 8208232735@axl</w:t>
-            </w:r>
-          </w:p>
-        </w:tc>
-      </w:tr>
-      <w:tr>
-        <w:tc>
-          <w:tcPr>
-            <w:tcW w:type="dxa" w:w="3312"/>
-            <w:shd w:fill="FFFFFF"/>
-            <w:tcMar>
-              <w:top w:w="100" w:type="dxa"/>
-              <w:bottom w:w="100" w:type="dxa"/>
-              <w:left w:w="120" w:type="dxa"/>
-              <w:right w:w="120" w:type="dxa"/>
-            </w:tcMar>
-          </w:tcPr>
-          <w:p>
-            <w:r>
-              <w:rPr>
-                <w:b/>
-                <w:sz w:val="19"/>
-              </w:rPr>
-              <w:t>Customer Data &amp; Ownership</w:t>
-            </w:r>
-          </w:p>
-        </w:tc>
-        <w:tc>
-          <w:tcPr>
-            <w:tcW w:type="dxa" w:w="3312"/>
-            <w:shd w:fill="FFFFFF"/>
-            <w:tcMar>
-              <w:top w:w="100" w:type="dxa"/>
-              <w:bottom w:w="100" w:type="dxa"/>
-              <w:left w:w="120" w:type="dxa"/>
-              <w:right w:w="120" w:type="dxa"/>
-            </w:tcMar>
-          </w:tcPr>
-          <w:p>
-            <w:r>
-              <w:rPr>
-                <w:sz w:val="19"/>
-              </w:rPr>
-              <w:t>Owned by third-party aggregator</w:t>
-            </w:r>
-          </w:p>
-        </w:tc>
-        <w:tc>
-          <w:tcPr>
-            <w:tcW w:type="dxa" w:w="3312"/>
-            <w:shd w:fill="F0FDF4"/>
-            <w:tcMar>
-              <w:top w:w="100" w:type="dxa"/>
-              <w:bottom w:w="100" w:type="dxa"/>
-              <w:left w:w="120" w:type="dxa"/>
-              <w:right w:w="120" w:type="dxa"/>
-            </w:tcMar>
-          </w:tcPr>
-          <w:p>
-            <w:r>
-              <w:rPr>
-                <w:b/>
-                <w:color w:val="2D7A3A"/>
-                <w:sz w:val="19"/>
-              </w:rPr>
-              <w:t>100% Owned by Pratham Tarde (Direct customer list)</w:t>
-            </w:r>
-          </w:p>
-        </w:tc>
-      </w:tr>
-      <w:tr>
-        <w:tc>
-          <w:tcPr>
-            <w:tcW w:type="dxa" w:w="3312"/>
-            <w:shd w:fill="F8FAFC"/>
-            <w:tcMar>
-              <w:top w:w="100" w:type="dxa"/>
-              <w:bottom w:w="100" w:type="dxa"/>
-              <w:left w:w="120" w:type="dxa"/>
-              <w:right w:w="120" w:type="dxa"/>
-            </w:tcMar>
-          </w:tcPr>
-          <w:p>
-            <w:r>
-              <w:rPr>
-                <w:b/>
-                <w:sz w:val="19"/>
-              </w:rPr>
-              <w:t>Delivery Pricing Logic</w:t>
-            </w:r>
-          </w:p>
-        </w:tc>
-        <w:tc>
-          <w:tcPr>
-            <w:tcW w:type="dxa" w:w="3312"/>
-            <w:shd w:fill="F8FAFC"/>
-            <w:tcMar>
-              <w:top w:w="100" w:type="dxa"/>
-              <w:bottom w:w="100" w:type="dxa"/>
-              <w:left w:w="120" w:type="dxa"/>
-              <w:right w:w="120" w:type="dxa"/>
-            </w:tcMar>
-          </w:tcPr>
-          <w:p>
-            <w:r>
-              <w:rPr>
-                <w:sz w:val="19"/>
-              </w:rPr>
-              <w:t>Dynamic surge pricing &amp; hidden fees</w:t>
-            </w:r>
-          </w:p>
-        </w:tc>
-        <w:tc>
-          <w:tcPr>
-            <w:tcW w:type="dxa" w:w="3312"/>
-            <w:shd w:fill="F0FDF4"/>
-            <w:tcMar>
-              <w:top w:w="100" w:type="dxa"/>
-              <w:bottom w:w="100" w:type="dxa"/>
-              <w:left w:w="120" w:type="dxa"/>
-              <w:right w:w="120" w:type="dxa"/>
-            </w:tcMar>
-          </w:tcPr>
-          <w:p>
-            <w:r>
-              <w:rPr>
-                <w:b/>
-                <w:color w:val="2D7A3A"/>
-                <w:sz w:val="19"/>
-              </w:rPr>
-              <w:t>Transparent distance-based (₹5/km, Free &gt; ₹2,000)</w:t>
-            </w:r>
-          </w:p>
-        </w:tc>
-      </w:tr>
-      <w:tr>
-        <w:tc>
-          <w:tcPr>
-            <w:tcW w:type="dxa" w:w="3312"/>
-            <w:shd w:fill="FFFFFF"/>
-            <w:tcMar>
-              <w:top w:w="100" w:type="dxa"/>
-              <w:bottom w:w="100" w:type="dxa"/>
-              <w:left w:w="120" w:type="dxa"/>
-              <w:right w:w="120" w:type="dxa"/>
-            </w:tcMar>
-          </w:tcPr>
-          <w:p>
-            <w:r>
-              <w:rPr>
-                <w:b/>
-                <w:sz w:val="19"/>
-              </w:rPr>
-              <w:t>Customer Support</w:t>
-            </w:r>
-          </w:p>
-        </w:tc>
-        <w:tc>
-          <w:tcPr>
-            <w:tcW w:type="dxa" w:w="3312"/>
-            <w:shd w:fill="FFFFFF"/>
-            <w:tcMar>
-              <w:top w:w="100" w:type="dxa"/>
-              <w:bottom w:w="100" w:type="dxa"/>
-              <w:left w:w="120" w:type="dxa"/>
-              <w:right w:w="120" w:type="dxa"/>
-            </w:tcMar>
-          </w:tcPr>
-          <w:p>
-            <w:r>
-              <w:rPr>
-                <w:sz w:val="19"/>
-              </w:rPr>
-              <w:t>Impersonal automated bot support</w:t>
-            </w:r>
-          </w:p>
-        </w:tc>
-        <w:tc>
-          <w:tcPr>
-            <w:tcW w:type="dxa" w:w="3312"/>
-            <w:shd w:fill="F0FDF4"/>
-            <w:tcMar>
-              <w:top w:w="100" w:type="dxa"/>
-              <w:bottom w:w="100" w:type="dxa"/>
-              <w:left w:w="120" w:type="dxa"/>
-              <w:right w:w="120" w:type="dxa"/>
-            </w:tcMar>
-          </w:tcPr>
-          <w:p>
-            <w:r>
-              <w:rPr>
-                <w:b/>
-                <w:color w:val="2D7A3A"/>
-                <w:sz w:val="19"/>
-              </w:rPr>
-              <w:t>1-Click Direct WhatsApp chat with store owner</w:t>
-            </w:r>
-          </w:p>
-        </w:tc>
-      </w:tr>
-    </w:tbl>
-    <w:p>
-      <w:pPr>
-        <w:spacing w:after="240"/>
-      </w:pPr>
-    </w:p>
-    <w:p>
-      <w:pPr>
-        <w:pStyle w:val="Heading1"/>
-        <w:spacing w:before="280" w:after="120"/>
-      </w:pPr>
-      <w:r>
-        <w:t>2. Complete Feature Breakdown</w:t>
-      </w:r>
-    </w:p>
-    <w:p>
-      <w:pPr>
-        <w:pStyle w:val="Heading2"/>
         <w:spacing w:before="240" w:after="80"/>
       </w:pPr>
       <w:r>
-        <w:t>A. Customer Storefront &amp; Mobile-First PWA Experience</w:t>
+        <w:t>2. What This Website Does for Your Shop</w:t>
       </w:r>
     </w:p>
     <w:p>
@@ -676,17 +504,17 @@
       <w:r>
         <w:rPr>
           <w:b/>
-          <w:color w:val="1E293B"/>
+          <w:color w:val="2D7A3A"/>
           <w:sz w:val="20"/>
         </w:rPr>
-        <w:t xml:space="preserve">Guest-First Free Browsing: </w:t>
+        <w:t xml:space="preserve">100% Direct UPI Payments to Your Bank: </w:t>
       </w:r>
       <w:r>
         <w:rPr>
           <w:color w:val="1E293B"/>
           <w:sz w:val="20"/>
         </w:rPr>
-        <w:t>Customers can freely scroll products, view deals, browse categories, and check nutrition without any forced login barriers upfront.</w:t>
+        <w:t>When customers pay online using Google Pay, PhonePe, or Paytm, the money goes 100% directly into your UPI ID (8208232735@axl). There are no third-party cut fees or commission charges.</w:t>
       </w:r>
     </w:p>
     <w:p>
@@ -696,17 +524,17 @@
       <w:r>
         <w:rPr>
           <w:b/>
-          <w:color w:val="1E293B"/>
+          <w:color w:val="2D7A3A"/>
           <w:sz w:val="20"/>
         </w:rPr>
-        <w:t xml:space="preserve">Action-Triggered Authentication: </w:t>
+        <w:t xml:space="preserve">Zero Platform Commission (0% Cut): </w:t>
       </w:r>
       <w:r>
         <w:rPr>
           <w:color w:val="1E293B"/>
           <w:sz w:val="20"/>
         </w:rPr>
-        <w:t>When an unauthenticated visitor clicks 'Add to Cart' or 'Proceed to Checkout', a sleek Login / Register portal opens seamlessly. Once logged in, their pending action immediately executes!</w:t>
+        <w:t>Unlike apps like Blinkit or Zepto that take 15% to 25% of your money, here 100% of your selling price and delivery charge stays in your pocket.</w:t>
       </w:r>
     </w:p>
     <w:p>
@@ -716,17 +544,17 @@
       <w:r>
         <w:rPr>
           <w:b/>
-          <w:color w:val="1E293B"/>
+          <w:color w:val="2D7A3A"/>
           <w:sz w:val="20"/>
         </w:rPr>
-        <w:t xml:space="preserve">Mobile Dedicated Search Bar: </w:t>
+        <w:t xml:space="preserve">You Own All Your Customers: </w:t>
       </w:r>
       <w:r>
         <w:rPr>
           <w:color w:val="1E293B"/>
           <w:sz w:val="20"/>
         </w:rPr>
-        <w:t>Full-width, thumb-friendly search bar with real-time autocomplete suggestions across product names, brands, categories, and tags.</w:t>
+        <w:t>You have the full list of your customers' names, phone numbers, and delivery addresses in Khamgaon. No middleman controls your business.</w:t>
       </w:r>
     </w:p>
     <w:p>
@@ -736,17 +564,17 @@
       <w:r>
         <w:rPr>
           <w:b/>
-          <w:color w:val="1E293B"/>
+          <w:color w:val="2D7A3A"/>
           <w:sz w:val="20"/>
         </w:rPr>
-        <w:t xml:space="preserve">Progressive Web App (PWA): </w:t>
+        <w:t xml:space="preserve">Automatic Distance-Based Delivery: </w:t>
       </w:r>
       <w:r>
         <w:rPr>
           <w:color w:val="1E293B"/>
           <w:sz w:val="20"/>
         </w:rPr>
-        <w:t>Customers can install Kirana Point directly onto their Android or iOS home screen without downloading from app stores.</w:t>
+        <w:t>The website automatically calculates the exact road distance from your shop in Khamgaon to the customer's home (₹5 per kilometer, Free delivery over ₹2,000).</w:t>
       </w:r>
     </w:p>
     <w:p>
@@ -756,26 +584,26 @@
       <w:r>
         <w:rPr>
           <w:b/>
-          <w:color w:val="1E293B"/>
+          <w:color w:val="2D7A3A"/>
           <w:sz w:val="20"/>
         </w:rPr>
-        <w:t xml:space="preserve">Sticky Action Bar on Mobile: </w:t>
+        <w:t xml:space="preserve">Works on Any Mobile Phone (Like an App): </w:t>
       </w:r>
       <w:r>
         <w:rPr>
           <w:color w:val="1E293B"/>
           <w:sz w:val="20"/>
         </w:rPr>
-        <w:t>When browsing product details on mobile phones, a persistent bottom bar allows instant 1-tap cart addition without scrolling.</w:t>
+        <w:t>Customers and you can open the website on Android phones or iPhones, and even tap 'Add to Home Screen' to use it like a mobile app.</w:t>
       </w:r>
     </w:p>
     <w:p>
       <w:pPr>
-        <w:pStyle w:val="Heading2"/>
-        <w:spacing w:before="240" w:after="80"/>
+        <w:pStyle w:val="Heading1"/>
+        <w:spacing w:before="280" w:after="80"/>
       </w:pPr>
       <w:r>
-        <w:t>B. Zero-Fee Direct UPI Payment System</w:t>
+        <w:t>3. How Your Customers Shop on Your Website</w:t>
       </w:r>
     </w:p>
     <w:p>
@@ -785,17 +613,17 @@
       <w:r>
         <w:rPr>
           <w:b/>
-          <w:color w:val="1E293B"/>
+          <w:color w:val="C25E00"/>
           <w:sz w:val="20"/>
         </w:rPr>
-        <w:t xml:space="preserve">Direct-to-Bank Transfers: </w:t>
+        <w:t xml:space="preserve">Step 1: Open Website &amp; Browse Items: </w:t>
       </w:r>
       <w:r>
         <w:rPr>
           <w:color w:val="1E293B"/>
           <w:sz w:val="20"/>
         </w:rPr>
-        <w:t>All payments route directly into Pratham Tarde's UPI ID (8208232735@axl) with ₹0 middleman gateway deductions.</w:t>
+        <w:t>Customers open https://kirana-point.vercel.app on their phone. They can easily scroll through Atta, Rice, Dal, Milk, Oil, Masalas, Snacks, and Fresh Vegetables.</w:t>
       </w:r>
     </w:p>
     <w:p>
@@ -805,17 +633,17 @@
       <w:r>
         <w:rPr>
           <w:b/>
-          <w:color w:val="1E293B"/>
+          <w:color w:val="C25E00"/>
           <w:sz w:val="20"/>
         </w:rPr>
-        <w:t xml:space="preserve">UPI Deep Linking (GPay / PhonePe / Paytm): </w:t>
+        <w:t xml:space="preserve">Step 2: Search or Filter: </w:t>
       </w:r>
       <w:r>
         <w:rPr>
           <w:color w:val="1E293B"/>
           <w:sz w:val="20"/>
         </w:rPr>
-        <w:t>Customers on mobile phones can tap Google Pay, PhonePe, or Paytm buttons which pre-fill the exact order amount and store payee name automatically.</w:t>
+        <w:t>They can type in the search box (e.g. 'Tata Salt', 'Amul Butter', 'Aashirvaad Atta') to instantly find what they need.</w:t>
       </w:r>
     </w:p>
     <w:p>
@@ -825,17 +653,17 @@
       <w:r>
         <w:rPr>
           <w:b/>
-          <w:color w:val="1E293B"/>
+          <w:color w:val="C25E00"/>
           <w:sz w:val="20"/>
         </w:rPr>
-        <w:t xml:space="preserve">Dynamic QR Code Generator: </w:t>
+        <w:t xml:space="preserve">Step 3: Add to Cart: </w:t>
       </w:r>
       <w:r>
         <w:rPr>
           <w:color w:val="1E293B"/>
           <w:sz w:val="20"/>
         </w:rPr>
-        <w:t>Desktop shoppers get an automatically generated UPI QR code that can be scanned using any mobile camera or scanner app.</w:t>
+        <w:t>They tap 'Add' and use the '+' or '-' buttons to choose their desired quantity (1 kg, 5 kg, 1 liter, packets, etc.).</w:t>
       </w:r>
     </w:p>
     <w:p>
@@ -845,17 +673,17 @@
       <w:r>
         <w:rPr>
           <w:b/>
-          <w:color w:val="1E293B"/>
+          <w:color w:val="C25E00"/>
           <w:sz w:val="20"/>
         </w:rPr>
-        <w:t xml:space="preserve">Payment Claim &amp; Verification Queue: </w:t>
+        <w:t xml:space="preserve">Step 4: Choose Delivery or Pickup: </w:t>
       </w:r>
       <w:r>
         <w:rPr>
           <w:color w:val="1E293B"/>
           <w:sz w:val="20"/>
         </w:rPr>
-        <w:t>Customers tap 'I Have Completed Payment' after transferring, which sends the order into the Admin Verification queue for 1-click confirmation.</w:t>
+        <w:t>They select whether they want Doorstep Home Delivery in Khamgaon or Store Counter Pickup.</w:t>
       </w:r>
     </w:p>
     <w:p>
@@ -865,26 +693,17 @@
       <w:r>
         <w:rPr>
           <w:b/>
-          <w:color w:val="1E293B"/>
+          <w:color w:val="C25E00"/>
           <w:sz w:val="20"/>
         </w:rPr>
-        <w:t xml:space="preserve">Cash on Delivery (COD) Support: </w:t>
+        <w:t xml:space="preserve">Step 5: Pay via UPI or Cash on Delivery: </w:t>
       </w:r>
       <w:r>
         <w:rPr>
           <w:color w:val="1E293B"/>
           <w:sz w:val="20"/>
         </w:rPr>
-        <w:t>Customers also have the flexibility to select Cash on Delivery with 1-click.</w:t>
-      </w:r>
-    </w:p>
-    <w:p>
-      <w:pPr>
-        <w:pStyle w:val="Heading2"/>
-        <w:spacing w:before="240" w:after="80"/>
-      </w:pPr>
-      <w:r>
-        <w:t>C. Precision GPS Distance-Based Delivery Engine</w:t>
+        <w:t>They can tap Google Pay, PhonePe, or Paytm to pay directly to your UPI ID, or choose Cash on Delivery (COD).</w:t>
       </w:r>
     </w:p>
     <w:p>
@@ -894,17 +713,151 @@
       <w:r>
         <w:rPr>
           <w:b/>
-          <w:color w:val="1E293B"/>
+          <w:color w:val="C25E00"/>
           <w:sz w:val="20"/>
         </w:rPr>
-        <w:t xml:space="preserve">Haversine Distance Algorithm: </w:t>
+        <w:t xml:space="preserve">Step 6: Live Tracking &amp; WhatsApp Receipt: </w:t>
       </w:r>
       <w:r>
         <w:rPr>
           <w:color w:val="1E293B"/>
           <w:sz w:val="20"/>
         </w:rPr>
-        <w:t>Calculates precise road distance between the store hub in Khamgaon (20.6865° N, 76.5654° E) and the customer's delivery pin.</w:t>
+        <w:t>They receive an instant order summary and can message your store directly on WhatsApp in 1 tap.</w:t>
+      </w:r>
+    </w:p>
+    <w:p>
+      <w:pPr>
+        <w:pStyle w:val="Heading1"/>
+        <w:spacing w:before="280" w:after="80"/>
+      </w:pPr>
+      <w:r>
+        <w:t>4. How to Manage Your Store Daily (Step-by-Step)</w:t>
+      </w:r>
+    </w:p>
+    <w:p>
+      <w:pPr>
+        <w:pStyle w:val="Heading2"/>
+        <w:spacing w:before="160" w:after="40"/>
+      </w:pPr>
+      <w:r>
+        <w:t>A. How to Log in to Your Admin Dashboard</w:t>
+      </w:r>
+    </w:p>
+    <w:p>
+      <w:r>
+        <w:rPr>
+          <w:color w:val="1E293B"/>
+          <w:sz w:val="19"/>
+        </w:rPr>
+        <w:t>1. Open the website on your phone or computer.</w:t>
+        <w:br/>
+        <w:t>2. Tap 'Admin' in the top corner or go to /admin.</w:t>
+        <w:br/>
+        <w:t>3. Enter: pratham@kiranapoint.com and password: admin123.</w:t>
+        <w:br/>
+        <w:t>4. Your Store Dashboard will open showing total sales, pending orders, and low stock alerts.</w:t>
+      </w:r>
+    </w:p>
+    <w:p>
+      <w:pPr>
+        <w:pStyle w:val="Heading2"/>
+        <w:spacing w:before="160" w:after="40"/>
+      </w:pPr>
+      <w:r>
+        <w:t>B. How to Check &amp; Process New Customer Orders</w:t>
+      </w:r>
+    </w:p>
+    <w:p>
+      <w:r>
+        <w:rPr>
+          <w:color w:val="1E293B"/>
+          <w:sz w:val="19"/>
+        </w:rPr>
+        <w:t>1. Tap 'Orders' in your Admin menu.</w:t>
+        <w:br/>
+        <w:t>2. You will see new orders marked as 'Awaiting Payment' or 'Order Placed'.</w:t>
+        <w:br/>
+        <w:t>3. Tap on any order to see the full customer bill, items list, customer phone number, and delivery address.</w:t>
+        <w:br/>
+        <w:t>4. If the customer paid by UPI, check your UPI app (GPay/PhonePe). Once confirmed, click 'Verify Payment ✅'.</w:t>
+      </w:r>
+    </w:p>
+    <w:p>
+      <w:pPr>
+        <w:pStyle w:val="Heading2"/>
+        <w:spacing w:before="160" w:after="40"/>
+      </w:pPr>
+      <w:r>
+        <w:t>C. How to Update Order Status (Dispatching)</w:t>
+      </w:r>
+    </w:p>
+    <w:p>
+      <w:r>
+        <w:rPr>
+          <w:color w:val="1E293B"/>
+          <w:sz w:val="19"/>
+        </w:rPr>
+        <w:t>1. When you start packing items in your shop, click 'Mark as Preparing 📦'.</w:t>
+        <w:br/>
+        <w:t>2. When your delivery person leaves to deliver, click 'Dispatch Out for Delivery 🚚'.</w:t>
+        <w:br/>
+        <w:t>3. When delivered, click 'Mark as Delivered ✅'. (The customer's screen updates automatically!).</w:t>
+      </w:r>
+    </w:p>
+    <w:p>
+      <w:pPr>
+        <w:pStyle w:val="Heading2"/>
+        <w:spacing w:before="160" w:after="40"/>
+      </w:pPr>
+      <w:r>
+        <w:t>D. How to Change Prices or Stock Quantities</w:t>
+      </w:r>
+    </w:p>
+    <w:p>
+      <w:r>
+        <w:rPr>
+          <w:color w:val="1E293B"/>
+          <w:sz w:val="19"/>
+        </w:rPr>
+        <w:t>1. Tap 'Product Catalog' in the Admin menu.</w:t>
+        <w:br/>
+        <w:t>2. Tap 'Edit' on any item (e.g. Tata Salt or Fortune Oil).</w:t>
+        <w:br/>
+        <w:t>3. Change the Selling Price or update the Stock Quantity.</w:t>
+        <w:br/>
+        <w:t>4. Click 'Save Changes' — your website updates instantly!</w:t>
+      </w:r>
+    </w:p>
+    <w:p>
+      <w:pPr>
+        <w:pStyle w:val="Heading2"/>
+        <w:spacing w:before="160" w:after="40"/>
+      </w:pPr>
+      <w:r>
+        <w:t>E. How to Add a New Product to Your Store</w:t>
+      </w:r>
+    </w:p>
+    <w:p>
+      <w:r>
+        <w:rPr>
+          <w:color w:val="1E293B"/>
+          <w:sz w:val="19"/>
+        </w:rPr>
+        <w:t>1. Tap 'Add New Product'.</w:t>
+        <w:br/>
+        <w:t>2. Enter product name, brand, category, MRP, and your selling price.</w:t>
+        <w:br/>
+        <w:t>3. Click Save — the new item immediately appears for customers to buy.</w:t>
+      </w:r>
+    </w:p>
+    <w:p>
+      <w:pPr>
+        <w:pStyle w:val="Heading1"/>
+        <w:spacing w:before="280" w:after="80"/>
+      </w:pPr>
+      <w:r>
+        <w:t>5. Simple Tips to Grow Your Orders in Khamgaon</w:t>
       </w:r>
     </w:p>
     <w:p>
@@ -914,17 +867,17 @@
       <w:r>
         <w:rPr>
           <w:b/>
-          <w:color w:val="1E293B"/>
+          <w:color w:val="2D7A3A"/>
           <w:sz w:val="20"/>
         </w:rPr>
-        <w:t xml:space="preserve">Transparent Pricing Rules: </w:t>
+        <w:t xml:space="preserve">Share on WhatsApp Status &amp; Groups: </w:t>
       </w:r>
       <w:r>
         <w:rPr>
           <w:color w:val="1E293B"/>
           <w:sz w:val="20"/>
         </w:rPr>
-        <w:t>Free delivery automatically applies for orders of ₹2,000 or above, or store pickup. Orders below ₹2,000 are charged at an honest ₹5 per kilometer (min ₹20).</w:t>
+        <w:t>Post your store link (https://kirana-point.vercel.app) on your WhatsApp status and local Khamgaon community groups so regular customers can order anytime.</w:t>
       </w:r>
     </w:p>
     <w:p>
@@ -934,17 +887,17 @@
       <w:r>
         <w:rPr>
           <w:b/>
-          <w:color w:val="1E293B"/>
+          <w:color w:val="2D7A3A"/>
           <w:sz w:val="20"/>
         </w:rPr>
-        <w:t xml:space="preserve">Interactive Leaflet Map: </w:t>
+        <w:t xml:space="preserve">Print a QR Code on Your Counter: </w:t>
       </w:r>
       <w:r>
         <w:rPr>
           <w:color w:val="1E293B"/>
           <w:sz w:val="20"/>
         </w:rPr>
-        <w:t>Customers can drag the map marker to their exact doorstep or tap 'Use My GPS' for 1-click geolocation detection.</w:t>
+        <w:t>Put a small board on your counter saying 'Order Online from Home: https://kirana-point.vercel.app'.</w:t>
       </w:r>
     </w:p>
     <w:p>
@@ -954,544 +907,17 @@
       <w:r>
         <w:rPr>
           <w:b/>
-          <w:color w:val="1E293B"/>
+          <w:color w:val="2D7A3A"/>
           <w:sz w:val="20"/>
         </w:rPr>
-        <w:t xml:space="preserve">Service Radius Guard: </w:t>
+        <w:t xml:space="preserve">Offer Same-Day Delivery: </w:t>
       </w:r>
       <w:r>
         <w:rPr>
           <w:color w:val="1E293B"/>
           <w:sz w:val="20"/>
         </w:rPr>
-        <w:t>Orders beyond the store's 15km delivery perimeter are prompted to choose store pickup, preventing unserviceable deliveries.</w:t>
-      </w:r>
-    </w:p>
-    <w:p>
-      <w:pPr>
-        <w:pStyle w:val="Heading2"/>
-        <w:spacing w:before="240" w:after="80"/>
-      </w:pPr>
-      <w:r>
-        <w:t>D. Open Food Facts Automated Cataloging &amp; Competitor Pricing</w:t>
-      </w:r>
-    </w:p>
-    <w:p>
-      <w:pPr>
-        <w:pStyle w:val="ListBullet"/>
-      </w:pPr>
-      <w:r>
-        <w:rPr>
-          <w:b/>
-          <w:color w:val="1E293B"/>
-          <w:sz w:val="20"/>
-        </w:rPr>
-        <w:t xml:space="preserve">1-Click Barcode / Product Auto-Fill: </w:t>
-      </w:r>
-      <w:r>
-        <w:rPr>
-          <w:color w:val="1E293B"/>
-          <w:sz w:val="20"/>
-        </w:rPr>
-        <w:t>Store managers can enter a barcode or search term to auto-fetch official descriptions, ingredients, package quantities, and full nutrition tables from the Open Food Facts global database.</w:t>
-      </w:r>
-    </w:p>
-    <w:p>
-      <w:pPr>
-        <w:pStyle w:val="ListBullet"/>
-      </w:pPr>
-      <w:r>
-        <w:rPr>
-          <w:b/>
-          <w:color w:val="1E293B"/>
-          <w:sz w:val="20"/>
-        </w:rPr>
-        <w:t xml:space="preserve">Competitor Price Comparison Widget: </w:t>
-      </w:r>
-      <w:r>
-        <w:rPr>
-          <w:color w:val="1E293B"/>
-          <w:sz w:val="20"/>
-        </w:rPr>
-        <w:t>Each product page features a live comparison showing Kirana Point's low price vs Blinkit, Zepto, BigBasket, and JioMart, highlighting customer savings!</w:t>
-      </w:r>
-    </w:p>
-    <w:p>
-      <w:pPr>
-        <w:pStyle w:val="Heading2"/>
-        <w:spacing w:before="240" w:after="80"/>
-      </w:pPr>
-      <w:r>
-        <w:t>E. WhatsApp Business Automation</w:t>
-      </w:r>
-    </w:p>
-    <w:p>
-      <w:pPr>
-        <w:pStyle w:val="ListBullet"/>
-      </w:pPr>
-      <w:r>
-        <w:rPr>
-          <w:b/>
-          <w:color w:val="1E293B"/>
-          <w:sz w:val="20"/>
-        </w:rPr>
-        <w:t xml:space="preserve">1-Click Invoice Notification: </w:t>
-      </w:r>
-      <w:r>
-        <w:rPr>
-          <w:color w:val="1E293B"/>
-          <w:sz w:val="20"/>
-        </w:rPr>
-        <w:t>Formatted WhatsApp invoice drafts with order breakdown, items list, total amount, and delivery address sent directly via wa.me.</w:t>
-      </w:r>
-    </w:p>
-    <w:p>
-      <w:pPr>
-        <w:pStyle w:val="ListBullet"/>
-      </w:pPr>
-      <w:r>
-        <w:rPr>
-          <w:b/>
-          <w:color w:val="1E293B"/>
-          <w:sz w:val="20"/>
-        </w:rPr>
-        <w:t xml:space="preserve">Direct Customer Support: </w:t>
-      </w:r>
-      <w:r>
-        <w:rPr>
-          <w:color w:val="1E293B"/>
-          <w:sz w:val="20"/>
-        </w:rPr>
-        <w:t>A floating WhatsApp button allows customers to connect with the store manager in 1 tap for custom grocery requests or special delivery notes.</w:t>
-      </w:r>
-    </w:p>
-    <w:p>
-      <w:pPr>
-        <w:pStyle w:val="Heading2"/>
-        <w:spacing w:before="240" w:after="80"/>
-      </w:pPr>
-      <w:r>
-        <w:t>F. Complete Store Management Console (Admin Portal)</w:t>
-      </w:r>
-    </w:p>
-    <w:p>
-      <w:pPr>
-        <w:pStyle w:val="ListBullet"/>
-      </w:pPr>
-      <w:r>
-        <w:rPr>
-          <w:b/>
-          <w:color w:val="1E293B"/>
-          <w:sz w:val="20"/>
-        </w:rPr>
-        <w:t xml:space="preserve">Visual Order Status Pipeline: </w:t>
-      </w:r>
-      <w:r>
-        <w:rPr>
-          <w:color w:val="1E293B"/>
-          <w:sz w:val="20"/>
-        </w:rPr>
-        <w:t>Interactive stepper moving orders through: Confirmed ➔ Packing &amp; Preparing ➔ Out for Delivery ➔ Delivered / Picked Up.</w:t>
-      </w:r>
-    </w:p>
-    <w:p>
-      <w:pPr>
-        <w:pStyle w:val="ListBullet"/>
-      </w:pPr>
-      <w:r>
-        <w:rPr>
-          <w:b/>
-          <w:color w:val="1E293B"/>
-          <w:sz w:val="20"/>
-        </w:rPr>
-        <w:t xml:space="preserve">Payment Verification Panel: </w:t>
-      </w:r>
-      <w:r>
-        <w:rPr>
-          <w:color w:val="1E293B"/>
-          <w:sz w:val="20"/>
-        </w:rPr>
-        <w:t>Dedicated queue highlighting unverified UPI transfers for quick verification.</w:t>
-      </w:r>
-    </w:p>
-    <w:p>
-      <w:pPr>
-        <w:pStyle w:val="ListBullet"/>
-      </w:pPr>
-      <w:r>
-        <w:rPr>
-          <w:b/>
-          <w:color w:val="1E293B"/>
-          <w:sz w:val="20"/>
-        </w:rPr>
-        <w:t xml:space="preserve">Inventory &amp; Low Stock Alerts: </w:t>
-      </w:r>
-      <w:r>
-        <w:rPr>
-          <w:color w:val="1E293B"/>
-          <w:sz w:val="20"/>
-        </w:rPr>
-        <w:t>Real-time indicators warning when essential staples or dairy products drop below threshold.</w:t>
-      </w:r>
-    </w:p>
-    <w:p>
-      <w:pPr>
-        <w:pStyle w:val="ListBullet"/>
-      </w:pPr>
-      <w:r>
-        <w:rPr>
-          <w:b/>
-          <w:color w:val="1E293B"/>
-          <w:sz w:val="20"/>
-        </w:rPr>
-        <w:t xml:space="preserve">Product Catalog Management: </w:t>
-      </w:r>
-      <w:r>
-        <w:rPr>
-          <w:color w:val="1E293B"/>
-          <w:sz w:val="20"/>
-        </w:rPr>
-        <w:t>Full control to add new products, edit pricing/discounts, update images, or toggle stock availability.</w:t>
-      </w:r>
-    </w:p>
-    <w:p>
-      <w:pPr>
-        <w:pStyle w:val="ListBullet"/>
-      </w:pPr>
-      <w:r>
-        <w:rPr>
-          <w:b/>
-          <w:color w:val="1E293B"/>
-          <w:sz w:val="20"/>
-        </w:rPr>
-        <w:t xml:space="preserve">Revenue Analytics &amp; Reports: </w:t>
-      </w:r>
-      <w:r>
-        <w:rPr>
-          <w:color w:val="1E293B"/>
-          <w:sz w:val="20"/>
-        </w:rPr>
-        <w:t>Visual charts tracking daily/weekly sales volume, popular items, and customer transaction counts.</w:t>
-      </w:r>
-    </w:p>
-    <w:p>
-      <w:pPr>
-        <w:pStyle w:val="ListBullet"/>
-      </w:pPr>
-      <w:r>
-        <w:rPr>
-          <w:b/>
-          <w:color w:val="1E293B"/>
-          <w:sz w:val="20"/>
-        </w:rPr>
-        <w:t xml:space="preserve">Store Settings Customizer: </w:t>
-      </w:r>
-      <w:r>
-        <w:rPr>
-          <w:color w:val="1E293B"/>
-          <w:sz w:val="20"/>
-        </w:rPr>
-        <w:t>Easily update delivery rates per km, free delivery thresholds, operating hours, and store coordinates.</w:t>
-      </w:r>
-    </w:p>
-    <w:p>
-      <w:pPr>
-        <w:pStyle w:val="Heading1"/>
-        <w:spacing w:before="320" w:after="120"/>
-      </w:pPr>
-      <w:r>
-        <w:t>3. Store Credentials &amp; Access Guide</w:t>
-      </w:r>
-    </w:p>
-    <w:tbl>
-      <w:tblPr>
-        <w:tblW w:type="auto" w:w="0"/>
-        <w:jc w:val="center"/>
-        <w:tblLook w:firstColumn="1" w:firstRow="1" w:lastColumn="0" w:lastRow="0" w:noHBand="0" w:noVBand="1" w:val="04A0"/>
-      </w:tblPr>
-      <w:tblGrid>
-        <w:gridCol w:w="2484"/>
-        <w:gridCol w:w="2484"/>
-        <w:gridCol w:w="2484"/>
-        <w:gridCol w:w="2484"/>
-      </w:tblGrid>
-      <w:tr>
-        <w:tc>
-          <w:tcPr>
-            <w:tcW w:type="dxa" w:w="2484"/>
-            <w:shd w:fill="2D7A3A"/>
-            <w:tcMar>
-              <w:top w:w="100" w:type="dxa"/>
-              <w:bottom w:w="100" w:type="dxa"/>
-              <w:left w:w="120" w:type="dxa"/>
-              <w:right w:w="120" w:type="dxa"/>
-            </w:tcMar>
-          </w:tcPr>
-          <w:p>
-            <w:r>
-              <w:rPr>
-                <w:b/>
-                <w:color w:val="FFFFFF"/>
-                <w:sz w:val="20"/>
-              </w:rPr>
-              <w:t>User Role</w:t>
-            </w:r>
-          </w:p>
-        </w:tc>
-        <w:tc>
-          <w:tcPr>
-            <w:tcW w:type="dxa" w:w="2484"/>
-            <w:shd w:fill="2D7A3A"/>
-            <w:tcMar>
-              <w:top w:w="100" w:type="dxa"/>
-              <w:bottom w:w="100" w:type="dxa"/>
-              <w:left w:w="120" w:type="dxa"/>
-              <w:right w:w="120" w:type="dxa"/>
-            </w:tcMar>
-          </w:tcPr>
-          <w:p>
-            <w:r>
-              <w:rPr>
-                <w:b/>
-                <w:color w:val="FFFFFF"/>
-                <w:sz w:val="20"/>
-              </w:rPr>
-              <w:t>Login Identifier</w:t>
-            </w:r>
-          </w:p>
-        </w:tc>
-        <w:tc>
-          <w:tcPr>
-            <w:tcW w:type="dxa" w:w="2484"/>
-            <w:shd w:fill="2D7A3A"/>
-            <w:tcMar>
-              <w:top w:w="100" w:type="dxa"/>
-              <w:bottom w:w="100" w:type="dxa"/>
-              <w:left w:w="120" w:type="dxa"/>
-              <w:right w:w="120" w:type="dxa"/>
-            </w:tcMar>
-          </w:tcPr>
-          <w:p>
-            <w:r>
-              <w:rPr>
-                <w:b/>
-                <w:color w:val="FFFFFF"/>
-                <w:sz w:val="20"/>
-              </w:rPr>
-              <w:t>Password</w:t>
-            </w:r>
-          </w:p>
-        </w:tc>
-        <w:tc>
-          <w:tcPr>
-            <w:tcW w:type="dxa" w:w="2484"/>
-            <w:shd w:fill="2D7A3A"/>
-            <w:tcMar>
-              <w:top w:w="100" w:type="dxa"/>
-              <w:bottom w:w="100" w:type="dxa"/>
-              <w:left w:w="120" w:type="dxa"/>
-              <w:right w:w="120" w:type="dxa"/>
-            </w:tcMar>
-          </w:tcPr>
-          <w:p>
-            <w:r>
-              <w:rPr>
-                <w:b/>
-                <w:color w:val="FFFFFF"/>
-                <w:sz w:val="20"/>
-              </w:rPr>
-              <w:t>Target Destination</w:t>
-            </w:r>
-          </w:p>
-        </w:tc>
-      </w:tr>
-      <w:tr>
-        <w:tc>
-          <w:tcPr>
-            <w:tcW w:type="dxa" w:w="2484"/>
-            <w:shd w:fill="FFFFFF"/>
-            <w:tcMar>
-              <w:top w:w="100" w:type="dxa"/>
-              <w:bottom w:w="100" w:type="dxa"/>
-              <w:left w:w="120" w:type="dxa"/>
-              <w:right w:w="120" w:type="dxa"/>
-            </w:tcMar>
-          </w:tcPr>
-          <w:p>
-            <w:r>
-              <w:rPr>
-                <w:b/>
-                <w:sz w:val="19"/>
-              </w:rPr>
-              <w:t>Store Owner (Admin)</w:t>
-            </w:r>
-          </w:p>
-        </w:tc>
-        <w:tc>
-          <w:tcPr>
-            <w:tcW w:type="dxa" w:w="2484"/>
-            <w:shd w:fill="FFFFFF"/>
-            <w:tcMar>
-              <w:top w:w="100" w:type="dxa"/>
-              <w:bottom w:w="100" w:type="dxa"/>
-              <w:left w:w="120" w:type="dxa"/>
-              <w:right w:w="120" w:type="dxa"/>
-            </w:tcMar>
-          </w:tcPr>
-          <w:p>
-            <w:r>
-              <w:rPr>
-                <w:sz w:val="19"/>
-              </w:rPr>
-              <w:t>pratham@kiranapoint.com</w:t>
-              <w:br/>
-              <w:t>(or mobile: 8208232735)</w:t>
-            </w:r>
-          </w:p>
-        </w:tc>
-        <w:tc>
-          <w:tcPr>
-            <w:tcW w:type="dxa" w:w="2484"/>
-            <w:shd w:fill="FFFFFF"/>
-            <w:tcMar>
-              <w:top w:w="100" w:type="dxa"/>
-              <w:bottom w:w="100" w:type="dxa"/>
-              <w:left w:w="120" w:type="dxa"/>
-              <w:right w:w="120" w:type="dxa"/>
-            </w:tcMar>
-          </w:tcPr>
-          <w:p>
-            <w:r>
-              <w:rPr>
-                <w:sz w:val="19"/>
-              </w:rPr>
-              <w:t>admin123</w:t>
-            </w:r>
-          </w:p>
-        </w:tc>
-        <w:tc>
-          <w:tcPr>
-            <w:tcW w:type="dxa" w:w="2484"/>
-            <w:shd w:fill="FFFFFF"/>
-            <w:tcMar>
-              <w:top w:w="100" w:type="dxa"/>
-              <w:bottom w:w="100" w:type="dxa"/>
-              <w:left w:w="120" w:type="dxa"/>
-              <w:right w:w="120" w:type="dxa"/>
-            </w:tcMar>
-          </w:tcPr>
-          <w:p>
-            <w:r>
-              <w:rPr>
-                <w:sz w:val="19"/>
-              </w:rPr>
-              <w:t>/admin (Store Console)</w:t>
-            </w:r>
-          </w:p>
-        </w:tc>
-      </w:tr>
-      <w:tr>
-        <w:tc>
-          <w:tcPr>
-            <w:tcW w:type="dxa" w:w="2484"/>
-            <w:shd w:fill="F8FAFC"/>
-            <w:tcMar>
-              <w:top w:w="100" w:type="dxa"/>
-              <w:bottom w:w="100" w:type="dxa"/>
-              <w:left w:w="120" w:type="dxa"/>
-              <w:right w:w="120" w:type="dxa"/>
-            </w:tcMar>
-          </w:tcPr>
-          <w:p>
-            <w:r>
-              <w:rPr>
-                <w:b/>
-                <w:sz w:val="19"/>
-              </w:rPr>
-              <w:t>Customer Account</w:t>
-            </w:r>
-          </w:p>
-        </w:tc>
-        <w:tc>
-          <w:tcPr>
-            <w:tcW w:type="dxa" w:w="2484"/>
-            <w:shd w:fill="F8FAFC"/>
-            <w:tcMar>
-              <w:top w:w="100" w:type="dxa"/>
-              <w:bottom w:w="100" w:type="dxa"/>
-              <w:left w:w="120" w:type="dxa"/>
-              <w:right w:w="120" w:type="dxa"/>
-            </w:tcMar>
-          </w:tcPr>
-          <w:p>
-            <w:r>
-              <w:rPr>
-                <w:sz w:val="19"/>
-              </w:rPr>
-              <w:t>Any customer email / phone</w:t>
-              <w:br/>
-              <w:t>(or register new account)</w:t>
-            </w:r>
-          </w:p>
-        </w:tc>
-        <w:tc>
-          <w:tcPr>
-            <w:tcW w:type="dxa" w:w="2484"/>
-            <w:shd w:fill="F8FAFC"/>
-            <w:tcMar>
-              <w:top w:w="100" w:type="dxa"/>
-              <w:bottom w:w="100" w:type="dxa"/>
-              <w:left w:w="120" w:type="dxa"/>
-              <w:right w:w="120" w:type="dxa"/>
-            </w:tcMar>
-          </w:tcPr>
-          <w:p>
-            <w:r>
-              <w:rPr>
-                <w:sz w:val="19"/>
-              </w:rPr>
-              <w:t>Customer's chosen password</w:t>
-            </w:r>
-          </w:p>
-        </w:tc>
-        <w:tc>
-          <w:tcPr>
-            <w:tcW w:type="dxa" w:w="2484"/>
-            <w:shd w:fill="F8FAFC"/>
-            <w:tcMar>
-              <w:top w:w="100" w:type="dxa"/>
-              <w:bottom w:w="100" w:type="dxa"/>
-              <w:left w:w="120" w:type="dxa"/>
-              <w:right w:w="120" w:type="dxa"/>
-            </w:tcMar>
-          </w:tcPr>
-          <w:p>
-            <w:r>
-              <w:rPr>
-                <w:sz w:val="19"/>
-              </w:rPr>
-              <w:t>/ (Grocery Storefront)</w:t>
-            </w:r>
-          </w:p>
-        </w:tc>
-      </w:tr>
-    </w:tbl>
-    <w:p>
-      <w:pPr>
-        <w:pStyle w:val="Heading1"/>
-        <w:spacing w:before="320" w:after="120"/>
-      </w:pPr>
-      <w:r>
-        <w:t>4. Deployment &amp; Next Steps</w:t>
-      </w:r>
-    </w:p>
-    <w:p>
-      <w:r>
-        <w:t>1. Cloud Hosting: The application is pushed to GitHub (https://github.com/Neilarmstrong-00/Kirana-Point) and is ready for 1-click deployment on Vercel.</w:t>
-        <w:br/>
-        <w:t>2. Custom Domain: Can be mapped to any custom domain (e.g. www.kiranapoint.in or www.kiranapoint.com).</w:t>
-        <w:br/>
-        <w:t>3. Live Operations: Store manager Pratham Tarde can log in, verify UPI payments, dispatch local orders, and update stock daily with zero technical complexity!</w:t>
+        <w:t>Deliver local orders within 30-45 minutes to build trusted, loyal neighbourhood customers.</w:t>
       </w:r>
     </w:p>
     <w:sectPr>

</xml_diff>